<commit_message>
Fixing typos in lab 1 document.
</commit_message>
<xml_diff>
--- a/Assignments/Labs/lab1/CSCI151_Lab1.docx
+++ b/Assignments/Labs/lab1/CSCI151_Lab1.docx
@@ -70,6 +70,9 @@
         <w:br/>
       </w:r>
       <w:r>
+        <w:rPr>
+          <w:noProof/>
+        </w:rPr>
         <w:drawing>
           <wp:inline distT="0" distB="0" distL="0" distR="0" wp14:anchorId="746061C6" wp14:editId="3571EE61">
             <wp:extent cx="1158340" cy="586791"/>
@@ -149,13 +152,14 @@
     </w:p>
     <w:p>
       <w:r>
-        <w:t>1648.7212707001282</w:t>
-      </w:r>
-    </w:p>
-    <w:p>
+        <w:t>1648.7212707001281</w:t>
+      </w:r>
+      <w:r>
+        <w:t xml:space="preserve"> </w:t>
+      </w:r>
       <w:r>
         <w:pict w14:anchorId="777A6EEC">
-          <v:rect id="_x0000_i1026" style="width:0;height:1.5pt" o:hralign="center" o:hrstd="t" o:hr="t" fillcolor="#a0a0a0" stroked="f"/>
+          <v:rect id="_x0000_i1025" style="width:0;height:1.5pt" o:hralign="center" o:hrstd="t" o:hr="t" fillcolor="#a0a0a0" stroked="f"/>
         </w:pict>
       </w:r>
     </w:p>
@@ -178,6 +182,9 @@
     </w:p>
     <w:p>
       <w:r>
+        <w:rPr>
+          <w:noProof/>
+        </w:rPr>
         <w:drawing>
           <wp:inline distT="0" distB="0" distL="0" distR="0" wp14:anchorId="1F3E3E9E" wp14:editId="1BDC8A74">
             <wp:extent cx="2270957" cy="541067"/>
@@ -217,7 +224,10 @@
     </w:p>
     <w:p>
       <w:r>
-        <w:t>where u and v are independent real numbers uniformly distributed between 0 and 1.</w:t>
+        <w:t>where u and v are independent real numbers uniformly distributed between</w:t>
+      </w:r>
+      <w:r>
+        <w:t xml:space="preserve"> </w:t>
       </w:r>
     </w:p>
     <w:p>
@@ -235,6 +245,9 @@
       <w:r>
         <w:t>Use random.random() to generate u and v</w:t>
       </w:r>
+      <w:r>
+        <w:t>.</w:t>
+      </w:r>
     </w:p>
     <w:p>
       <w:pPr>
@@ -243,13 +256,11 @@
           <w:numId w:val="5"/>
         </w:numPr>
       </w:pPr>
-      <w:proofErr w:type="gramStart"/>
-      <w:r>
-        <w:t>Compute</w:t>
-      </w:r>
-      <w:proofErr w:type="gramEnd"/>
-      <w:r>
-        <w:t xml:space="preserve"> Z using the formula above</w:t>
+      <w:r>
+        <w:t>Compute Z using the formula above</w:t>
+      </w:r>
+      <w:r>
+        <w:t>.</w:t>
       </w:r>
     </w:p>
     <w:p>
@@ -301,18 +312,30 @@
     </w:p>
     <w:p>
       <w:r>
-        <w:t>-0.473812654109</w:t>
-      </w:r>
-    </w:p>
-    <w:p>
-      <w:r>
-        <w:t>(Note: Your output will differ each time the program is run.)</w:t>
+        <w:t>-1.6397220243958204</w:t>
+      </w:r>
+      <w:r>
+        <w:t xml:space="preserve"> </w:t>
+      </w:r>
+    </w:p>
+    <w:p>
+      <w:r>
+        <w:t>(</w:t>
+      </w:r>
+      <w:r>
+        <w:t>Note: Your output will vary each time the program runs. To reproduce the output shown above, initialize the random number generator with random.seed(1) near the top of your program, after the import statements.</w:t>
+      </w:r>
+      <w:r>
+        <w:t>)</w:t>
+      </w:r>
+      <w:r>
+        <w:t>.</w:t>
       </w:r>
     </w:p>
     <w:p>
       <w:r>
         <w:pict w14:anchorId="758A5AB1">
-          <v:rect id="_x0000_i1033" style="width:0;height:1.5pt" o:hralign="center" o:hrstd="t" o:hr="t" fillcolor="#a0a0a0" stroked="f"/>
+          <v:rect id="_x0000_i1026" style="width:0;height:1.5pt" o:hralign="center" o:hrstd="t" o:hr="t" fillcolor="#a0a0a0" stroked="f"/>
         </w:pict>
       </w:r>
     </w:p>
@@ -358,6 +381,9 @@
     </w:p>
     <w:p>
       <w:r>
+        <w:rPr>
+          <w:noProof/>
+        </w:rPr>
         <w:drawing>
           <wp:inline distT="0" distB="0" distL="0" distR="0" wp14:anchorId="0E729384" wp14:editId="5C91F5E9">
             <wp:extent cx="2110923" cy="1013548"/>
@@ -479,6 +505,7 @@
     </w:p>
     <w:p>
       <w:r>
+        <w:lastRenderedPageBreak/>
         <w:t>python mercator.py -75.0 40.0 -73.5</w:t>
       </w:r>
     </w:p>
@@ -494,25 +521,16 @@
           <w:b/>
           <w:bCs/>
         </w:rPr>
-        <w:lastRenderedPageBreak/>
         <w:t>Example output:</w:t>
       </w:r>
     </w:p>
     <w:p>
       <w:r>
-        <w:t>1.5</w:t>
-      </w:r>
-      <w:r>
-        <w:t xml:space="preserve"> </w:t>
-      </w:r>
-      <w:r>
-        <w:t>0.7629096520666107</w:t>
-      </w:r>
-    </w:p>
-    <w:p>
+        <w:t>0.02617993877991509 0.7629096520666105</w:t>
+      </w:r>
       <w:r>
         <w:pict w14:anchorId="040BC9DC">
-          <v:rect id="_x0000_i1046" style="width:0;height:1.5pt" o:hralign="center" o:hrstd="t" o:hr="t" fillcolor="#a0a0a0" stroked="f"/>
+          <v:rect id="_x0000_i1027" style="width:0;height:1.5pt" o:hralign="center" o:hrstd="t" o:hr="t" fillcolor="#a0a0a0" stroked="f"/>
         </w:pict>
       </w:r>
     </w:p>
@@ -632,6 +650,9 @@
     </w:p>
     <w:p>
       <w:r>
+        <w:rPr>
+          <w:noProof/>
+        </w:rPr>
         <w:drawing>
           <wp:inline distT="0" distB="0" distL="0" distR="0" wp14:anchorId="56F37300" wp14:editId="548F985F">
             <wp:extent cx="5464013" cy="1219306"/>
@@ -681,12 +702,12 @@
     </w:p>
     <w:p>
       <w:r>
+        <w:lastRenderedPageBreak/>
         <w:t>magenta = &lt;value&gt;</w:t>
       </w:r>
     </w:p>
     <w:p>
       <w:r>
-        <w:lastRenderedPageBreak/>
         <w:t>yellow  = &lt;value&gt;</w:t>
       </w:r>
     </w:p>
@@ -698,7 +719,7 @@
     <w:p>
       <w:r>
         <w:pict w14:anchorId="04779852">
-          <v:rect id="_x0000_i1051" style="width:0;height:1.5pt" o:hralign="center" o:hrstd="t" o:hr="t" fillcolor="#a0a0a0" stroked="f"/>
+          <v:rect id="_x0000_i1028" style="width:0;height:1.5pt" o:hralign="center" o:hrstd="t" o:hr="t" fillcolor="#a0a0a0" stroked="f"/>
         </w:pict>
       </w:r>
     </w:p>
@@ -739,7 +760,7 @@
     </w:p>
     <w:p>
       <w:r>
-        <w:t>cyan    = 0.4230769230769229</w:t>
+        <w:t>cyan = 0.423076923076923</w:t>
       </w:r>
     </w:p>
     <w:p>
@@ -749,18 +770,16 @@
     </w:p>
     <w:p>
       <w:r>
-        <w:t>yellow  = 0.0</w:t>
-      </w:r>
-    </w:p>
-    <w:p>
-      <w:r>
-        <w:t>black   = 0.4901960784313726</w:t>
-      </w:r>
-    </w:p>
-    <w:p>
+        <w:t>yellow = 0.0</w:t>
+      </w:r>
+    </w:p>
+    <w:p>
+      <w:r>
+        <w:t>black = 0.4901960784313726</w:t>
+      </w:r>
       <w:r>
         <w:pict w14:anchorId="7B1B4320">
-          <v:rect id="_x0000_i1052" style="width:0;height:1.5pt" o:hralign="center" o:hrstd="t" o:hr="t" fillcolor="#a0a0a0" stroked="f"/>
+          <v:rect id="_x0000_i1029" style="width:0;height:1.5pt" o:hralign="center" o:hrstd="t" o:hr="t" fillcolor="#a0a0a0" stroked="f"/>
         </w:pict>
       </w:r>
     </w:p>

</xml_diff>

<commit_message>
Pushing most recent changes.
</commit_message>
<xml_diff>
--- a/Assignments/Labs/lab1/CSCI151_Lab1.docx
+++ b/Assignments/Labs/lab1/CSCI151_Lab1.docx
@@ -152,10 +152,7 @@
     </w:p>
     <w:p>
       <w:r>
-        <w:t>1648.7212707001281</w:t>
-      </w:r>
-      <w:r>
-        <w:t xml:space="preserve"> </w:t>
+        <w:t xml:space="preserve">1648.7212707001281 </w:t>
       </w:r>
       <w:r>
         <w:pict w14:anchorId="777A6EEC">
@@ -227,7 +224,7 @@
         <w:t>where u and v are independent real numbers uniformly distributed between</w:t>
       </w:r>
       <w:r>
-        <w:t xml:space="preserve"> </w:t>
+        <w:t xml:space="preserve"> [0,1)</w:t>
       </w:r>
     </w:p>
     <w:p>
@@ -312,10 +309,7 @@
     </w:p>
     <w:p>
       <w:r>
-        <w:t>-1.6397220243958204</w:t>
-      </w:r>
-      <w:r>
-        <w:t xml:space="preserve"> </w:t>
+        <w:t xml:space="preserve">-1.6397220243958204 </w:t>
       </w:r>
     </w:p>
     <w:p>
@@ -3245,6 +3239,7 @@
   <w:style w:type="character" w:default="1" w:styleId="DefaultParagraphFont">
     <w:name w:val="Default Paragraph Font"/>
     <w:uiPriority w:val="1"/>
+    <w:semiHidden/>
     <w:unhideWhenUsed/>
   </w:style>
   <w:style w:type="table" w:default="1" w:styleId="TableNormal">

</xml_diff>